<commit_message>
Intial creation of the design document
</commit_message>
<xml_diff>
--- a/Design_Document.docx
+++ b/Design_Document.docx
@@ -254,6 +254,36 @@
           <w:highlight w:val="none"/>
           <w:lang w:val="en" w:bidi="en"/>
         </w:rPr>
+      </w:r>
+      <w:r>
+        <w:rPr>
+          <w:highlight w:val="none"/>
+          <w:lang w:val="en" w:bidi="en"/>
+        </w:rPr>
+      </w:r>
+      <w:r>
+        <w:rPr>
+          <w:highlight w:val="none"/>
+          <w:lang w:val="en" w:bidi="en"/>
+        </w:rPr>
+      </w:r>
+    </w:p>
+    <w:p>
+      <w:pPr>
+        <w:pBdr/>
+        <w:spacing/>
+        <w:ind/>
+        <w:rPr>
+          <w:highlight w:val="none"/>
+          <w:lang w:val="en" w:bidi="en"/>
+        </w:rPr>
+      </w:pPr>
+      <w:r>
+        <w:rPr>
+          <w:highlight w:val="none"/>
+          <w:lang w:val="en" w:bidi="en"/>
+        </w:rPr>
+        <w:t xml:space="preserve">Future employers/educators – My future boss/teacher could look at this project as an example I know how to independently learn python modules (as well as other programming concepts) and that I know how to apply this knowledge.</w:t>
       </w:r>
       <w:r>
         <w:rPr>

</xml_diff>